<commit_message>
Docs: the customer-card block must be pinned
Adding the block with "+ Block" only previews it (shown by a "Preview"
badge); it disappears when the merchant leaves the page until it's
pinned. Shopify requires merchants to add and pin admin blocks; apps
can't pin them. Discounts are unaffected (stored on the customer).

- Merchant guide: block step says "+ Block" then pin, plus a note
  explaining the Preview badge
- README, TROUBLESHOOTING (merchant + dev entries), readiness checklist
  and changelog updated; the dev "Failed to fetch" entry no longer
  attributes the Preview badge to a stale dev preview

Co-Authored-By: Claude Opus 5.5 <noreply@anthropic.com>
</commit_message>
<xml_diff>
--- a/docs/Brand-Discounts-Merchant-Guide.docx
+++ b/docs/Brand-Discounts-Merchant-Guide.docx
@@ -1225,7 +1225,7 @@
           <w:sz w:val="22"/>
           <w:szCs w:val="22"/>
         </w:rPr>
-        <w:t xml:space="preserve">Add block</w:t>
+        <w:t xml:space="preserve">+ Block</w:t>
       </w:r>
       <w:r>
         <w:rPr>
@@ -1269,7 +1269,7 @@
           <w:sz w:val="22"/>
           <w:szCs w:val="22"/>
         </w:rPr>
-        <w:t xml:space="preserve"> block. Once added, it appears on every customer page automatically.</w:t>
+        <w:t xml:space="preserve"> block, then click the pin icon on the block. Once pinned, it appears on every customer page automatically.</w:t>
       </w:r>
     </w:p>
     <w:p>
@@ -1468,6 +1468,35 @@
           <w:szCs w:val="22"/>
         </w:rPr>
         <w:t xml:space="preserve">Changes take effect at the customer’s next checkout.</w:t>
+      </w:r>
+    </w:p>
+    <w:p>
+      <w:pPr>
+        <w:pBdr>
+          <w:left w:val="single" w:color="1F4E79" w:sz="18" w:space="12"/>
+        </w:pBdr>
+        <w:spacing w:after="180" w:before="100" w:line="276"/>
+        <w:ind w:left="200"/>
+      </w:pPr>
+      <w:r>
+        <w:rPr>
+          <w:rFonts w:ascii="Calibri" w:cs="Calibri" w:eastAsia="Calibri" w:hAnsi="Calibri"/>
+          <w:b/>
+          <w:bCs/>
+          <w:color w:val="1F4E79"/>
+          <w:sz w:val="21"/>
+          <w:szCs w:val="21"/>
+        </w:rPr>
+        <w:t xml:space="preserve">Please note: </w:t>
+      </w:r>
+      <w:r>
+        <w:rPr>
+          <w:rFonts w:ascii="Calibri" w:cs="Calibri" w:eastAsia="Calibri" w:hAnsi="Calibri"/>
+          <w:color w:val="595959"/>
+          <w:sz w:val="21"/>
+          <w:szCs w:val="21"/>
+        </w:rPr>
+        <w:t xml:space="preserve">A block added with + Block only previews until you pin it: it shows a “Preview” badge and disappears when you leave the page. Pin it once and it stays on every customer page. Your discounts are saved on the customer either way, so nothing is lost.</w:t>
       </w:r>
     </w:p>
     <w:p>

</xml_diff>